<commit_message>
Complete V4 transverse FBG microstrain research design and validation
</commit_message>
<xml_diff>
--- a/versions/v4.0-transverse-microstrain/01_病害与文献证据.docx
+++ b/versions/v4.0-transverse-microstrain/01_病害与文献证据.docx
@@ -12,7 +12,7 @@
     </w:p>
     <w:p>
       <w:r>
-        <w:t>V4.0 工作稿　2026年10月27日　内容已保存 最终复核待完成</w:t>
+        <w:t>V4.0 研究设计版　2026年10月28日　样件与工程参数须实物验证</w:t>
       </w:r>
     </w:p>
     <w:p>
@@ -2485,7 +2485,7 @@
     </w:p>
     <w:p>
       <w:r>
-        <w:t>证据状态以2026-10-27本次取得的正文或既有记录标记。全文核对指本次读取了论文相关方法和结论，不等于复现其试验。文献中的测量体系、数字或预测效果不能移植成本项目成绩。</w:t>
+        <w:t>证据核查截至2026-10-28，区分本次取得的正文与继承记录。全文核对指本次读取了论文相关方法和结论，不等于复现其试验。文献中的测量体系、数字或预测效果不能移植成本项目成绩。</w:t>
       </w:r>
     </w:p>
     <w:p>
@@ -2854,6 +2854,70 @@
             <w:color w:val="245A75"/>
           </w:rPr>
           <w:t>https://doi.org/10.1016/j.yofte.2023.103564</w:t>
+        </w:r>
+      </w:hyperlink>
+      <w:r/>
+    </w:p>
+    <w:p>
+      <w:pPr>
+        <w:pStyle w:val="Heading2"/>
+      </w:pPr>
+      <w:r>
+        <w:t>R18 Zhang Zhu Shi 2016 土纤界面的直接验证</w:t>
+      </w:r>
+    </w:p>
+    <w:p>
+      <w:r>
+        <w:t>Role of the interface between distributed fibre optic strain sensor and soil in ground deformation measurement，Scientific Reports 6，36469。理论：土纤界面渐进滑移使纤维应变与土体应变分离，密度、含水率和覆压改变传递能力。采用BOTDA与摄影测量/PIV对照，不是离散FBG节点。</w:t>
+      </w:r>
+    </w:p>
+    <w:p>
+      <w:r>
+        <w:t>模型使用500×100×200 mm亚克力槽、长江洁净河砂，平均粒径0.35 mm，级配不良砂；地基组含水率10%、干密度1.60 g/cm³、相对密度0.84，五层填筑。距底50、83、116、150 mm分别铺设对称纤维，BOTDA空间分辨率50 mm、采样间隔25 mm。另做拉拔：干密度1.5—1.9 g/cm³、含水率8%—12%、外加覆压0—60 kPa，各因素并非所有数值同时全组合。</w:t>
+      </w:r>
+    </w:p>
+    <w:p>
+      <w:r>
+        <w:t>结论：在其测试条件下，提高密度或降低含水率增强界面结合；局部加载时纤维测得应变小于PIV土体应变，不能直接当作土体真值。正文也指出二维边界、图像误差和传感扰动等限制。用于V4：加入独立土标记和拔滑测量，密度、含水率分组，外加压力与土体自重分开记录。其8%—12%水分及荷载范围不能证明V4的2%/4%/6%最优。证据：2026-10-28核对原文Methods、Results与Discussion。</w:t>
+      </w:r>
+      <w:hyperlink r:id="rId26">
+        <w:r>
+          <w:rPr>
+            <w:color w:val="245A75"/>
+          </w:rPr>
+          <w:t>https://doi.org/10.1038/srep36469</w:t>
+        </w:r>
+      </w:hyperlink>
+      <w:r/>
+    </w:p>
+    <w:p>
+      <w:pPr>
+        <w:pStyle w:val="Heading2"/>
+      </w:pPr>
+      <w:r>
+        <w:t>R19 Zhu Gao Chen Cheng 2024 微锚固光缆拉拔</w:t>
+      </w:r>
+    </w:p>
+    <w:p>
+      <w:r>
+        <w:t>Interfacial behavior of soil-embedded fiber optic cables with micro-anchors for distributed strain sensing，Acta Geotechnica 19，1787—1798；在线发表于2023-07-10，卷期为2024，两个年份不应混写为不同论文。理论：锚固端承和摩擦、多个锚点的剪切区重叠影响应变传递。</w:t>
+      </w:r>
+    </w:p>
+    <w:p>
+      <w:r>
+        <w:t>采用南京粉质黏土、500×200×170 mm拉拔箱，分层约35 mm、文中土密度1.2×10³ kg/m³，不能未经换算称其为干密度。材料测试给出含水率13%；微锚为PE热缩管，锚距100/175/250/400 mm，FO-2缆比较锚径2.76/3.46 mm；外加压力0/5.97/8.69/16.85 kPa，BOTDA读沿缆应变。原文0 kPa为外加压力工况，不表示缆周围无自重应力。</w:t>
+      </w:r>
+    </w:p>
+    <w:p>
+      <w:r>
+        <w:t>结论：其试验中锚固缆与无锚缆有不同峰后响应；增加覆压或锚数提高总抗拔，过近锚距产生群锚影响、削弱单锚贡献；测试范围内锚径改变的作用较小。用于V4：不能默认锚点越密越好，需比较单节点与相邻节点；40×40 mm板锚和横向弯曲件不是该文验证对象。证据：2026-10-28核对出版社正文第2节和第5节，材料及几何值不直接移植为FBG最佳尺寸。</w:t>
+      </w:r>
+      <w:hyperlink r:id="rId27">
+        <w:r>
+          <w:rPr>
+            <w:color w:val="245A75"/>
+          </w:rPr>
+          <w:t>https://doi.org/10.1007/s11440-023-01956-8</w:t>
         </w:r>
       </w:hyperlink>
       <w:r/>
@@ -3480,7 +3544,12 @@
     </w:p>
     <w:p>
       <w:r>
-        <w:t>首轮优先补找低围压土体中横向FBG点阵的方向性实验、跨侧缘剪切位移转换、内部侵蚀的应变与出砂同步实验。现有R02采用纵向OFDR，R03采用杆式FBG，R09采用注浆介质光缆，均不能直接证明拟议横向节点的优越性。</w:t>
+        <w:t>R18和R19已补充土纤滑移、含水率及群锚效应的直接原始试验依据。仍缺低围压土体中本版横向双面FBG节点的方向性与微量程证据，以及内部侵蚀的FBG应变与出砂同步证据。R02采用纵向OFDR，R03采用杆式FBG，R09采用注浆介质光缆，R18/R19采用BOTDA，均不能直接证明本节点优越。内部侵蚀暂列后期研究，不承诺由普通应变FBG在颗粒流失前检出。</w:t>
+      </w:r>
+    </w:p>
+    <w:p>
+      <w:r>
+        <w:t>本版共19项来源，含原始论文、综述与USGS分类资料；不称为19篇全部全文验证的边坡预警实验。R15、R16、R17的证据级别仍按各自说明保留。新增检索经出版社和PMC原文回查；标准名称、版次及条款属于单独核验任务，不能用论文参考文献替代官方标准确认。</w:t>
       </w:r>
     </w:p>
     <w:p>
@@ -3510,7 +3579,7 @@
       <w:rPr>
         <w:sz w:val="18"/>
       </w:rPr>
-      <w:t xml:space="preserve">V4.0  |  2026-10-27  |  </w:t>
+      <w:t xml:space="preserve">V4.0  |  2026-10-28  |  </w:t>
     </w:r>
     <w:fldSimple w:instr="PAGE"/>
   </w:p>

</xml_diff>